<commit_message>
T06: báo cáo mục 1 và 1.1
- Mục 1: bối cảnh, quy mô giả định, vấn đề hiện tại; bảng phạm vi,
  tác nhân, thuật ngữ (thay chữ gợi ý xám bằng nội dung thật)
- Mục 1.1: MT-01..MT-07 kèm tiêu chí kiểm chứng và liên kết BR/Q/TC
- Kế hoạch: T06 -> Hoàn thành 100%; Viết báo cáo: mục 1, 1.1 hoàn thành
- Báo cáo tuần 1 (Khôi): viết lại gọn theo từng việc T02, T03, T08, T06,
  vướng mắc theo người, link sản phẩm
- Kế hoạch: việc "Hoàn thành" tự gạch ngang cột Công việc, chữ xám ở
  A–E, G–I (định dạng có điều kiện)

Co-Authored-By: Claude Opus 5.5 <noreply@anthropic.com>
</commit_message>
<xml_diff>
--- a/docs/INT1313_TX_G5_DeTai05_Telemedicine_v0.docx
+++ b/docs/INT1313_TX_G5_DeTai05_Telemedicine_v0.docx
@@ -524,35 +524,6 @@
       <w:r>
         <w:rPr>
           <w:rFonts w:ascii="Times New Roman" w:cs="Times New Roman" w:eastAsia="Times New Roman" w:hAnsi="Times New Roman"/>
-          <w:b w:val="1"/>
-          <w:bCs w:val="1"/>
-          <w:i w:val="1"/>
-          <w:iCs w:val="1"/>
-          <w:color w:val="7F7F7F"/>
-        </w:rPr>
-        <w:t xml:space="preserve">Phụ trách: </w:t>
-      </w:r>
-      <w:r>
-        <w:rPr>
-          <w:rFonts w:ascii="Times New Roman" w:cs="Times New Roman" w:eastAsia="Times New Roman" w:hAnsi="Times New Roman"/>
-          <w:i w:val="1"/>
-          <w:iCs w:val="1"/>
-          <w:color w:val="7F7F7F"/>
-        </w:rPr>
-        <w:t xml:space="preserve">Lê Ngọc Khôi (viết chính) – nộp ở v1, tuần 2.</w:t>
-      </w:r>
-    </w:p>
-    <w:p>
-      <w:pPr>
-        <w:ind w:left="284" w:firstLine="0"/>
-        <w:jc w:val="both"/>
-        <w:rPr>
-          <w:rFonts w:ascii="Times New Roman" w:cs="Times New Roman" w:eastAsia="Times New Roman" w:hAnsi="Times New Roman"/>
-        </w:rPr>
-      </w:pPr>
-      <w:r>
-        <w:rPr>
-          <w:rFonts w:ascii="Times New Roman" w:cs="Times New Roman" w:eastAsia="Times New Roman" w:hAnsi="Times New Roman"/>
           <w:rtl w:val="0"/>
         </w:rPr>
         <w:t xml:space="preserve">(– tham khảo tài liệu tiêu chuẩn ISO/IEC/IEEE 29148)</w:t>
@@ -578,7 +549,7 @@
     </w:p>
     <w:p>
       <w:pPr>
-        <w:ind w:left="567" w:hanging="284"/>
+        <w:ind w:left="284" w:firstLine="0"/>
         <w:jc w:val="both"/>
         <w:rPr>
           <w:rFonts w:ascii="Times New Roman" w:cs="Times New Roman" w:eastAsia="Times New Roman" w:hAnsi="Times New Roman"/>
@@ -587,11 +558,38 @@
       <w:r>
         <w:rPr>
           <w:rFonts w:ascii="Times New Roman" w:cs="Times New Roman" w:eastAsia="Times New Roman" w:hAnsi="Times New Roman"/>
-          <w:i w:val="1"/>
-          <w:iCs w:val="1"/>
-          <w:color w:val="7F7F7F"/>
-        </w:rPr>
-        <w:t xml:space="preserve">– Mô tả hoạt động của một phòng khám đa khoa có dịch vụ tư vấn từ xa (quy mô giả định: số cơ sở, số bác sĩ, số lượt khám/ngày).</w:t>
+        </w:rPr>
+        <w:t xml:space="preserve">Đồ án xây dựng cơ sở dữ liệu (CSDL) cho một phòng khám đa khoa tư nhân giả định có dịch vụ y tế từ xa. Quy mô giả định: 2 cơ sở khám, khoảng 20 bác sĩ (8 bác sĩ đa khoa, 12 bác sĩ chuyên khoa thuộc 6 chuyên khoa), 10 điều dưỡng và lễ tân, khoảng 150 lượt khám mỗi ngày, trong đó khoảng 20% là tư vấn từ xa.</w:t>
+      </w:r>
+    </w:p>
+    <w:p>
+      <w:pPr>
+        <w:ind w:left="284" w:firstLine="0"/>
+        <w:jc w:val="both"/>
+        <w:rPr>
+          <w:rFonts w:ascii="Times New Roman" w:cs="Times New Roman" w:eastAsia="Times New Roman" w:hAnsi="Times New Roman"/>
+        </w:rPr>
+      </w:pPr>
+      <w:r>
+        <w:rPr>
+          <w:rFonts w:ascii="Times New Roman" w:cs="Times New Roman" w:eastAsia="Times New Roman" w:hAnsi="Times New Roman"/>
+        </w:rPr>
+        <w:t xml:space="preserve">Bệnh nhân đặt lịch qua lễ tân hoặc trực tuyến, chọn khám trực tiếp tại cơ sở hoặc tư vấn từ xa qua video. Bác sĩ đa khoa khám ban đầu và lập giấy chuyển khi bệnh nhân cần khám chuyên khoa. Ở mỗi lần khám, bác sĩ ghi chẩn đoán theo mã ICD-10 và kê đơn thuốc điện tử; bệnh nhân thanh toán theo lịch hẹn.</w:t>
+      </w:r>
+    </w:p>
+    <w:p>
+      <w:pPr>
+        <w:ind w:left="284" w:firstLine="0"/>
+        <w:jc w:val="both"/>
+        <w:rPr>
+          <w:rFonts w:ascii="Times New Roman" w:cs="Times New Roman" w:eastAsia="Times New Roman" w:hAnsi="Times New Roman"/>
+        </w:rPr>
+      </w:pPr>
+      <w:r>
+        <w:rPr>
+          <w:rFonts w:ascii="Times New Roman" w:cs="Times New Roman" w:eastAsia="Times New Roman" w:hAnsi="Times New Roman"/>
+        </w:rPr>
+        <w:t xml:space="preserve">Các vấn đề hiện tại mà CSDL cần giải quyết:</w:t>
       </w:r>
     </w:p>
     <w:p>
@@ -605,11 +603,68 @@
       <w:r>
         <w:rPr>
           <w:rFonts w:ascii="Times New Roman" w:cs="Times New Roman" w:eastAsia="Times New Roman" w:hAnsi="Times New Roman"/>
-          <w:i w:val="1"/>
-          <w:iCs w:val="1"/>
-          <w:color w:val="7F7F7F"/>
-        </w:rPr>
-        <w:t xml:space="preserve">– Vấn đề hiện tại: lịch hẹn trùng giờ, hồ sơ phân tán, đơn thuốc viết tay, khó kiểm soát dị ứng thuốc, khó truy vết.</w:t>
+        </w:rPr>
+        <w:t xml:space="preserve">– Lịch hẹn ghi sổ và bảng tính nên thường trùng giờ hoặc rơi ngoài ca làm việc của bác sĩ.</w:t>
+      </w:r>
+    </w:p>
+    <w:p>
+      <w:pPr>
+        <w:ind w:left="567" w:hanging="284"/>
+        <w:jc w:val="both"/>
+        <w:rPr>
+          <w:rFonts w:ascii="Times New Roman" w:cs="Times New Roman" w:eastAsia="Times New Roman" w:hAnsi="Times New Roman"/>
+        </w:rPr>
+      </w:pPr>
+      <w:r>
+        <w:rPr>
+          <w:rFonts w:ascii="Times New Roman" w:cs="Times New Roman" w:eastAsia="Times New Roman" w:hAnsi="Times New Roman"/>
+        </w:rPr>
+        <w:t xml:space="preserve">– Hồ sơ bệnh án phân tán giữa hai cơ sở, khó xem lại lịch sử khám của một bệnh nhân.</w:t>
+      </w:r>
+    </w:p>
+    <w:p>
+      <w:pPr>
+        <w:ind w:left="567" w:hanging="284"/>
+        <w:jc w:val="both"/>
+        <w:rPr>
+          <w:rFonts w:ascii="Times New Roman" w:cs="Times New Roman" w:eastAsia="Times New Roman" w:hAnsi="Times New Roman"/>
+        </w:rPr>
+      </w:pPr>
+      <w:r>
+        <w:rPr>
+          <w:rFonts w:ascii="Times New Roman" w:cs="Times New Roman" w:eastAsia="Times New Roman" w:hAnsi="Times New Roman"/>
+        </w:rPr>
+        <w:t xml:space="preserve">– Đơn thuốc viết tay, không tự động kiểm tra thuốc mà bệnh nhân đã ghi nhận dị ứng.</w:t>
+      </w:r>
+    </w:p>
+    <w:p>
+      <w:pPr>
+        <w:ind w:left="567" w:hanging="284"/>
+        <w:jc w:val="both"/>
+        <w:rPr>
+          <w:rFonts w:ascii="Times New Roman" w:cs="Times New Roman" w:eastAsia="Times New Roman" w:hAnsi="Times New Roman"/>
+        </w:rPr>
+      </w:pPr>
+      <w:r>
+        <w:rPr>
+          <w:rFonts w:ascii="Times New Roman" w:cs="Times New Roman" w:eastAsia="Times New Roman" w:hAnsi="Times New Roman"/>
+        </w:rPr>
+        <w:t xml:space="preserve">– Không phân biệt rõ bác sĩ đa khoa và chuyên khoa khi phân công và khi chuyển chuyên khoa.</w:t>
+      </w:r>
+    </w:p>
+    <w:p>
+      <w:pPr>
+        <w:ind w:left="567" w:hanging="284"/>
+        <w:jc w:val="both"/>
+        <w:rPr>
+          <w:rFonts w:ascii="Times New Roman" w:cs="Times New Roman" w:eastAsia="Times New Roman" w:hAnsi="Times New Roman"/>
+        </w:rPr>
+      </w:pPr>
+      <w:r>
+        <w:rPr>
+          <w:rFonts w:ascii="Times New Roman" w:cs="Times New Roman" w:eastAsia="Times New Roman" w:hAnsi="Times New Roman"/>
+        </w:rPr>
+        <w:t xml:space="preserve">– Khó truy vết ai đã lập hoặc thay đổi dữ liệu y tế, khó lập báo cáo thống kê cho quản lý.</w:t>
       </w:r>
     </w:p>
     <w:p>
@@ -730,23 +785,17 @@
               <w:jc w:val="left"/>
               <w:rPr>
                 <w:rFonts w:ascii="Times New Roman" w:cs="Times New Roman" w:eastAsia="Times New Roman" w:hAnsi="Times New Roman"/>
-                <w:i w:val="1"/>
-                <w:iCs w:val="1"/>
-                <w:color w:val="7F7F7F"/>
-                <w:sz w:val="22"/>
-                <w:szCs w:val="22"/>
-              </w:rPr>
-            </w:pPr>
-            <w:r>
-              <w:rPr>
-                <w:rFonts w:ascii="Times New Roman" w:cs="Times New Roman" w:eastAsia="Times New Roman" w:hAnsi="Times New Roman"/>
-                <w:i w:val="1"/>
-                <w:iCs w:val="1"/>
-                <w:color w:val="7F7F7F"/>
-                <w:sz w:val="22"/>
-                <w:szCs w:val="22"/>
-              </w:rPr>
-              <w:t xml:space="preserve">Hồ sơ nhân viên y tế, chuyên khoa, chứng chỉ hành nghề, ca làm việc</w:t>
+                <w:sz w:val="22"/>
+                <w:szCs w:val="22"/>
+              </w:rPr>
+            </w:pPr>
+            <w:r>
+              <w:rPr>
+                <w:rFonts w:ascii="Times New Roman" w:cs="Times New Roman" w:eastAsia="Times New Roman" w:hAnsi="Times New Roman"/>
+                <w:sz w:val="22"/>
+                <w:szCs w:val="22"/>
+              </w:rPr>
+              <w:t xml:space="preserve">Nhân viên y tế (phân lớp bác sĩ đa khoa / chuyên khoa), chuyên khoa, chứng chỉ hành nghề, cơ sở khám, ca làm việc</w:t>
             </w:r>
           </w:p>
         </w:tc>
@@ -760,19 +809,13 @@
               <w:jc w:val="left"/>
               <w:rPr>
                 <w:rFonts w:ascii="Times New Roman" w:cs="Times New Roman" w:eastAsia="Times New Roman" w:hAnsi="Times New Roman"/>
-                <w:i w:val="1"/>
-                <w:iCs w:val="1"/>
-                <w:color w:val="7F7F7F"/>
-                <w:sz w:val="22"/>
-                <w:szCs w:val="22"/>
-              </w:rPr>
-            </w:pPr>
-            <w:r>
-              <w:rPr>
-                <w:rFonts w:ascii="Times New Roman" w:cs="Times New Roman" w:eastAsia="Times New Roman" w:hAnsi="Times New Roman"/>
-                <w:i w:val="1"/>
-                <w:iCs w:val="1"/>
-                <w:color w:val="7F7F7F"/>
+                <w:sz w:val="22"/>
+                <w:szCs w:val="22"/>
+              </w:rPr>
+            </w:pPr>
+            <w:r>
+              <w:rPr>
+                <w:rFonts w:ascii="Times New Roman" w:cs="Times New Roman" w:eastAsia="Times New Roman" w:hAnsi="Times New Roman"/>
                 <w:sz w:val="22"/>
                 <w:szCs w:val="22"/>
               </w:rPr>
@@ -795,23 +838,17 @@
               <w:jc w:val="left"/>
               <w:rPr>
                 <w:rFonts w:ascii="Times New Roman" w:cs="Times New Roman" w:eastAsia="Times New Roman" w:hAnsi="Times New Roman"/>
-                <w:i w:val="1"/>
-                <w:iCs w:val="1"/>
-                <w:color w:val="7F7F7F"/>
-                <w:sz w:val="22"/>
-                <w:szCs w:val="22"/>
-              </w:rPr>
-            </w:pPr>
-            <w:r>
-              <w:rPr>
-                <w:rFonts w:ascii="Times New Roman" w:cs="Times New Roman" w:eastAsia="Times New Roman" w:hAnsi="Times New Roman"/>
-                <w:i w:val="1"/>
-                <w:iCs w:val="1"/>
-                <w:color w:val="7F7F7F"/>
-                <w:sz w:val="22"/>
-                <w:szCs w:val="22"/>
-              </w:rPr>
-              <w:t xml:space="preserve">Bệnh nhân, đặt lịch hẹn khám trực tiếp / tư vấn từ xa, giấy chuyển chuyên khoa, hóa đơn</w:t>
+                <w:sz w:val="22"/>
+                <w:szCs w:val="22"/>
+              </w:rPr>
+            </w:pPr>
+            <w:r>
+              <w:rPr>
+                <w:rFonts w:ascii="Times New Roman" w:cs="Times New Roman" w:eastAsia="Times New Roman" w:hAnsi="Times New Roman"/>
+                <w:sz w:val="22"/>
+                <w:szCs w:val="22"/>
+              </w:rPr>
+              <w:t xml:space="preserve">Bệnh nhân, lịch hẹn khám trực tiếp / tư vấn từ xa, giấy chuyển chuyên khoa nội bộ phòng khám, hóa đơn</w:t>
             </w:r>
           </w:p>
         </w:tc>
@@ -825,23 +862,17 @@
               <w:jc w:val="left"/>
               <w:rPr>
                 <w:rFonts w:ascii="Times New Roman" w:cs="Times New Roman" w:eastAsia="Times New Roman" w:hAnsi="Times New Roman"/>
-                <w:i w:val="1"/>
-                <w:iCs w:val="1"/>
-                <w:color w:val="7F7F7F"/>
-                <w:sz w:val="22"/>
-                <w:szCs w:val="22"/>
-              </w:rPr>
-            </w:pPr>
-            <w:r>
-              <w:rPr>
-                <w:rFonts w:ascii="Times New Roman" w:cs="Times New Roman" w:eastAsia="Times New Roman" w:hAnsi="Times New Roman"/>
-                <w:i w:val="1"/>
-                <w:iCs w:val="1"/>
-                <w:color w:val="7F7F7F"/>
-                <w:sz w:val="22"/>
-                <w:szCs w:val="22"/>
-              </w:rPr>
-              <w:t xml:space="preserve">Cổng thanh toán thật, kết nối hệ thống BHYT quốc gia</w:t>
+                <w:sz w:val="22"/>
+                <w:szCs w:val="22"/>
+              </w:rPr>
+            </w:pPr>
+            <w:r>
+              <w:rPr>
+                <w:rFonts w:ascii="Times New Roman" w:cs="Times New Roman" w:eastAsia="Times New Roman" w:hAnsi="Times New Roman"/>
+                <w:sz w:val="22"/>
+                <w:szCs w:val="22"/>
+              </w:rPr>
+              <w:t xml:space="preserve">Cổng thanh toán thật; bảo hiểm y tế (thẻ, mức hưởng, chuyển tuyến giữa các cơ sở)</w:t>
             </w:r>
           </w:p>
         </w:tc>
@@ -860,23 +891,17 @@
               <w:jc w:val="left"/>
               <w:rPr>
                 <w:rFonts w:ascii="Times New Roman" w:cs="Times New Roman" w:eastAsia="Times New Roman" w:hAnsi="Times New Roman"/>
-                <w:i w:val="1"/>
-                <w:iCs w:val="1"/>
-                <w:color w:val="7F7F7F"/>
-                <w:sz w:val="22"/>
-                <w:szCs w:val="22"/>
-              </w:rPr>
-            </w:pPr>
-            <w:r>
-              <w:rPr>
-                <w:rFonts w:ascii="Times New Roman" w:cs="Times New Roman" w:eastAsia="Times New Roman" w:hAnsi="Times New Roman"/>
-                <w:i w:val="1"/>
-                <w:iCs w:val="1"/>
-                <w:color w:val="7F7F7F"/>
-                <w:sz w:val="22"/>
-                <w:szCs w:val="22"/>
-              </w:rPr>
-              <w:t xml:space="preserve">Hồ sơ bệnh án, lần khám, chẩn đoán (ICD-10), đơn thuốc điện tử, dị ứng</w:t>
+                <w:sz w:val="22"/>
+                <w:szCs w:val="22"/>
+              </w:rPr>
+            </w:pPr>
+            <w:r>
+              <w:rPr>
+                <w:rFonts w:ascii="Times New Roman" w:cs="Times New Roman" w:eastAsia="Times New Roman" w:hAnsi="Times New Roman"/>
+                <w:sz w:val="22"/>
+                <w:szCs w:val="22"/>
+              </w:rPr>
+              <w:t xml:space="preserve">Hồ sơ bệnh án, lần khám, chẩn đoán (ICD-10), đơn thuốc điện tử, thuốc và hoạt chất, dị ứng</w:t>
             </w:r>
           </w:p>
         </w:tc>
@@ -890,23 +915,70 @@
               <w:jc w:val="left"/>
               <w:rPr>
                 <w:rFonts w:ascii="Times New Roman" w:cs="Times New Roman" w:eastAsia="Times New Roman" w:hAnsi="Times New Roman"/>
-                <w:i w:val="1"/>
-                <w:iCs w:val="1"/>
-                <w:color w:val="7F7F7F"/>
-                <w:sz w:val="22"/>
-                <w:szCs w:val="22"/>
-              </w:rPr>
-            </w:pPr>
-            <w:r>
-              <w:rPr>
-                <w:rFonts w:ascii="Times New Roman" w:cs="Times New Roman" w:eastAsia="Times New Roman" w:hAnsi="Times New Roman"/>
-                <w:i w:val="1"/>
-                <w:iCs w:val="1"/>
-                <w:color w:val="7F7F7F"/>
+                <w:sz w:val="22"/>
+                <w:szCs w:val="22"/>
+              </w:rPr>
+            </w:pPr>
+            <w:r>
+              <w:rPr>
+                <w:rFonts w:ascii="Times New Roman" w:cs="Times New Roman" w:eastAsia="Times New Roman" w:hAnsi="Times New Roman"/>
                 <w:sz w:val="22"/>
                 <w:szCs w:val="22"/>
               </w:rPr>
               <w:t xml:space="preserve">Quản lý kho dược, nhập xuất thuốc; thiết bị y tế</w:t>
+            </w:r>
+          </w:p>
+        </w:tc>
+      </w:tr>
+      <w:tr>
+        <w:trPr>
+          <w:cantSplit/>
+        </w:trPr>
+        <w:tc>
+          <w:tcPr>
+            <w:tcW w:w="4395" w:type="dxa"/>
+          </w:tcPr>
+          <w:p>
+            <w:pPr>
+              <w:spacing w:before="20" w:after="20"/>
+              <w:jc w:val="left"/>
+              <w:rPr>
+                <w:rFonts w:ascii="Times New Roman" w:cs="Times New Roman" w:eastAsia="Times New Roman" w:hAnsi="Times New Roman"/>
+                <w:sz w:val="22"/>
+                <w:szCs w:val="22"/>
+              </w:rPr>
+            </w:pPr>
+            <w:r>
+              <w:rPr>
+                <w:rFonts w:ascii="Times New Roman" w:cs="Times New Roman" w:eastAsia="Times New Roman" w:hAnsi="Times New Roman"/>
+                <w:sz w:val="22"/>
+                <w:szCs w:val="22"/>
+              </w:rPr>
+              <w:t xml:space="preserve">Ràng buộc toàn vẹn (CHECK, FK, trigger), view, truy vấn thống kê, phân quyền theo vai trò; ứng dụng web demo</w:t>
+            </w:r>
+          </w:p>
+        </w:tc>
+        <w:tc>
+          <w:tcPr>
+            <w:tcW w:w="4395" w:type="dxa"/>
+          </w:tcPr>
+          <w:p>
+            <w:pPr>
+              <w:spacing w:before="20" w:after="20"/>
+              <w:jc w:val="left"/>
+              <w:rPr>
+                <w:rFonts w:ascii="Times New Roman" w:cs="Times New Roman" w:eastAsia="Times New Roman" w:hAnsi="Times New Roman"/>
+                <w:sz w:val="22"/>
+                <w:szCs w:val="22"/>
+              </w:rPr>
+            </w:pPr>
+            <w:r>
+              <w:rPr>
+                <w:rFonts w:ascii="Times New Roman" w:cs="Times New Roman" w:eastAsia="Times New Roman" w:hAnsi="Times New Roman"/>
+                <w:sz w:val="22"/>
+                <w:szCs w:val="22"/>
+              </w:rPr>
+              <w:t xml:space="preserve">Ứng dụng di động, gửi thông báo SMS/email, chữ ký số trên hồ sơ bệnh án</w:t>
             </w:r>
           </w:p>
         </w:tc>
@@ -1067,19 +1139,13 @@
               <w:jc w:val="left"/>
               <w:rPr>
                 <w:rFonts w:ascii="Times New Roman" w:cs="Times New Roman" w:eastAsia="Times New Roman" w:hAnsi="Times New Roman"/>
-                <w:i w:val="1"/>
-                <w:iCs w:val="1"/>
-                <w:color w:val="7F7F7F"/>
-                <w:sz w:val="22"/>
-                <w:szCs w:val="22"/>
-              </w:rPr>
-            </w:pPr>
-            <w:r>
-              <w:rPr>
-                <w:rFonts w:ascii="Times New Roman" w:cs="Times New Roman" w:eastAsia="Times New Roman" w:hAnsi="Times New Roman"/>
-                <w:i w:val="1"/>
-                <w:iCs w:val="1"/>
-                <w:color w:val="7F7F7F"/>
+                <w:sz w:val="22"/>
+                <w:szCs w:val="22"/>
+              </w:rPr>
+            </w:pPr>
+            <w:r>
+              <w:rPr>
+                <w:rFonts w:ascii="Times New Roman" w:cs="Times New Roman" w:eastAsia="Times New Roman" w:hAnsi="Times New Roman"/>
                 <w:sz w:val="22"/>
                 <w:szCs w:val="22"/>
               </w:rPr>
@@ -1097,23 +1163,17 @@
               <w:jc w:val="left"/>
               <w:rPr>
                 <w:rFonts w:ascii="Times New Roman" w:cs="Times New Roman" w:eastAsia="Times New Roman" w:hAnsi="Times New Roman"/>
-                <w:i w:val="1"/>
-                <w:iCs w:val="1"/>
-                <w:color w:val="7F7F7F"/>
-                <w:sz w:val="22"/>
-                <w:szCs w:val="22"/>
-              </w:rPr>
-            </w:pPr>
-            <w:r>
-              <w:rPr>
-                <w:rFonts w:ascii="Times New Roman" w:cs="Times New Roman" w:eastAsia="Times New Roman" w:hAnsi="Times New Roman"/>
-                <w:i w:val="1"/>
-                <w:iCs w:val="1"/>
-                <w:color w:val="7F7F7F"/>
-                <w:sz w:val="22"/>
-                <w:szCs w:val="22"/>
-              </w:rPr>
-              <w:t xml:space="preserve">Người đặt lịch, khám và nhận đơn thuốc</w:t>
+                <w:sz w:val="22"/>
+                <w:szCs w:val="22"/>
+              </w:rPr>
+            </w:pPr>
+            <w:r>
+              <w:rPr>
+                <w:rFonts w:ascii="Times New Roman" w:cs="Times New Roman" w:eastAsia="Times New Roman" w:hAnsi="Times New Roman"/>
+                <w:sz w:val="22"/>
+                <w:szCs w:val="22"/>
+              </w:rPr>
+              <w:t xml:space="preserve">Người đặt lịch, khám trực tiếp hoặc tư vấn từ xa, nhận đơn thuốc</w:t>
             </w:r>
           </w:p>
         </w:tc>
@@ -1127,23 +1187,17 @@
               <w:jc w:val="left"/>
               <w:rPr>
                 <w:rFonts w:ascii="Times New Roman" w:cs="Times New Roman" w:eastAsia="Times New Roman" w:hAnsi="Times New Roman"/>
-                <w:i w:val="1"/>
-                <w:iCs w:val="1"/>
-                <w:color w:val="7F7F7F"/>
-                <w:sz w:val="22"/>
-                <w:szCs w:val="22"/>
-              </w:rPr>
-            </w:pPr>
-            <w:r>
-              <w:rPr>
-                <w:rFonts w:ascii="Times New Roman" w:cs="Times New Roman" w:eastAsia="Times New Roman" w:hAnsi="Times New Roman"/>
-                <w:i w:val="1"/>
-                <w:iCs w:val="1"/>
-                <w:color w:val="7F7F7F"/>
-                <w:sz w:val="22"/>
-                <w:szCs w:val="22"/>
-              </w:rPr>
-              <w:t xml:space="preserve">Xem lịch hẹn, hồ sơ, đơn thuốc của chính mình</w:t>
+                <w:sz w:val="22"/>
+                <w:szCs w:val="22"/>
+              </w:rPr>
+            </w:pPr>
+            <w:r>
+              <w:rPr>
+                <w:rFonts w:ascii="Times New Roman" w:cs="Times New Roman" w:eastAsia="Times New Roman" w:hAnsi="Times New Roman"/>
+                <w:sz w:val="22"/>
+                <w:szCs w:val="22"/>
+              </w:rPr>
+              <w:t xml:space="preserve">Xem lịch hẹn, hồ sơ bệnh án, đơn thuốc, hóa đơn của chính mình</w:t>
             </w:r>
           </w:p>
         </w:tc>
@@ -1190,6 +1244,14 @@
                 <w:szCs w:val="22"/>
               </w:rPr>
             </w:pPr>
+            <w:r>
+              <w:rPr>
+                <w:rFonts w:ascii="Times New Roman" w:cs="Times New Roman" w:eastAsia="Times New Roman" w:hAnsi="Times New Roman"/>
+                <w:sz w:val="22"/>
+                <w:szCs w:val="22"/>
+              </w:rPr>
+              <w:t xml:space="preserve">Tiếp nhận bệnh nhân, đặt, xác nhận, hủy lịch hẹn, thu phí</w:t>
+            </w:r>
           </w:p>
         </w:tc>
         <w:tc>
@@ -1206,6 +1268,14 @@
                 <w:szCs w:val="22"/>
               </w:rPr>
             </w:pPr>
+            <w:r>
+              <w:rPr>
+                <w:rFonts w:ascii="Times New Roman" w:cs="Times New Roman" w:eastAsia="Times New Roman" w:hAnsi="Times New Roman"/>
+                <w:sz w:val="22"/>
+                <w:szCs w:val="22"/>
+              </w:rPr>
+              <w:t xml:space="preserve">Thêm, sửa bệnh nhân, lịch hẹn, hóa đơn; xem lịch làm việc bác sĩ; không xem nội dung bệnh án</w:t>
+            </w:r>
           </w:p>
         </w:tc>
       </w:tr>
@@ -1251,6 +1321,14 @@
                 <w:szCs w:val="22"/>
               </w:rPr>
             </w:pPr>
+            <w:r>
+              <w:rPr>
+                <w:rFonts w:ascii="Times New Roman" w:cs="Times New Roman" w:eastAsia="Times New Roman" w:hAnsi="Times New Roman"/>
+                <w:sz w:val="22"/>
+                <w:szCs w:val="22"/>
+              </w:rPr>
+              <w:t xml:space="preserve">Khám ban đầu, chẩn đoán, kê đơn, lập giấy chuyển chuyên khoa</w:t>
+            </w:r>
           </w:p>
         </w:tc>
         <w:tc>
@@ -1267,6 +1345,14 @@
                 <w:szCs w:val="22"/>
               </w:rPr>
             </w:pPr>
+            <w:r>
+              <w:rPr>
+                <w:rFonts w:ascii="Times New Roman" w:cs="Times New Roman" w:eastAsia="Times New Roman" w:hAnsi="Times New Roman"/>
+                <w:sz w:val="22"/>
+                <w:szCs w:val="22"/>
+              </w:rPr>
+              <w:t xml:space="preserve">Xem lịch hẹn của mình và bệnh án; thêm lần khám, chẩn đoán, đơn thuốc, giấy chuyển</w:t>
+            </w:r>
           </w:p>
         </w:tc>
       </w:tr>
@@ -1312,6 +1398,14 @@
                 <w:szCs w:val="22"/>
               </w:rPr>
             </w:pPr>
+            <w:r>
+              <w:rPr>
+                <w:rFonts w:ascii="Times New Roman" w:cs="Times New Roman" w:eastAsia="Times New Roman" w:hAnsi="Times New Roman"/>
+                <w:sz w:val="22"/>
+                <w:szCs w:val="22"/>
+              </w:rPr>
+              <w:t xml:space="preserve">Khám theo chuyên khoa (có giấy chuyển hoặc tái khám), tư vấn từ xa</w:t>
+            </w:r>
           </w:p>
         </w:tc>
         <w:tc>
@@ -1328,6 +1422,14 @@
                 <w:szCs w:val="22"/>
               </w:rPr>
             </w:pPr>
+            <w:r>
+              <w:rPr>
+                <w:rFonts w:ascii="Times New Roman" w:cs="Times New Roman" w:eastAsia="Times New Roman" w:hAnsi="Times New Roman"/>
+                <w:sz w:val="22"/>
+                <w:szCs w:val="22"/>
+              </w:rPr>
+              <w:t xml:space="preserve">Như bác sĩ đa khoa, trừ lập giấy chuyển chuyên khoa</w:t>
+            </w:r>
           </w:p>
         </w:tc>
       </w:tr>
@@ -1373,6 +1475,14 @@
                 <w:szCs w:val="22"/>
               </w:rPr>
             </w:pPr>
+            <w:r>
+              <w:rPr>
+                <w:rFonts w:ascii="Times New Roman" w:cs="Times New Roman" w:eastAsia="Times New Roman" w:hAnsi="Times New Roman"/>
+                <w:sz w:val="22"/>
+                <w:szCs w:val="22"/>
+              </w:rPr>
+              <w:t xml:space="preserve">Hỗ trợ bác sĩ trong ca làm việc</w:t>
+            </w:r>
           </w:p>
         </w:tc>
         <w:tc>
@@ -1389,6 +1499,14 @@
                 <w:szCs w:val="22"/>
               </w:rPr>
             </w:pPr>
+            <w:r>
+              <w:rPr>
+                <w:rFonts w:ascii="Times New Roman" w:cs="Times New Roman" w:eastAsia="Times New Roman" w:hAnsi="Times New Roman"/>
+                <w:sz w:val="22"/>
+                <w:szCs w:val="22"/>
+              </w:rPr>
+              <w:t xml:space="preserve">Xem lịch làm việc và lịch hẹn trong ca; không kê đơn</w:t>
+            </w:r>
           </w:p>
         </w:tc>
       </w:tr>
@@ -1434,6 +1552,14 @@
                 <w:szCs w:val="22"/>
               </w:rPr>
             </w:pPr>
+            <w:r>
+              <w:rPr>
+                <w:rFonts w:ascii="Times New Roman" w:cs="Times New Roman" w:eastAsia="Times New Roman" w:hAnsi="Times New Roman"/>
+                <w:sz w:val="22"/>
+                <w:szCs w:val="22"/>
+              </w:rPr>
+              <w:t xml:space="preserve">Quản lý nhân viên, chuyên khoa, chứng chỉ, ca làm việc và phân quyền</w:t>
+            </w:r>
           </w:p>
         </w:tc>
         <w:tc>
@@ -1450,6 +1576,14 @@
                 <w:szCs w:val="22"/>
               </w:rPr>
             </w:pPr>
+            <w:r>
+              <w:rPr>
+                <w:rFonts w:ascii="Times New Roman" w:cs="Times New Roman" w:eastAsia="Times New Roman" w:hAnsi="Times New Roman"/>
+                <w:sz w:val="22"/>
+                <w:szCs w:val="22"/>
+              </w:rPr>
+              <w:t xml:space="preserve">Toàn quyền trên CSDL; xem báo cáo thống kê</w:t>
+            </w:r>
           </w:p>
         </w:tc>
       </w:tr>
@@ -1579,19 +1713,13 @@
               <w:jc w:val="left"/>
               <w:rPr>
                 <w:rFonts w:ascii="Times New Roman" w:cs="Times New Roman" w:eastAsia="Times New Roman" w:hAnsi="Times New Roman"/>
-                <w:i w:val="1"/>
-                <w:iCs w:val="1"/>
-                <w:color w:val="7F7F7F"/>
-                <w:sz w:val="22"/>
-                <w:szCs w:val="22"/>
-              </w:rPr>
-            </w:pPr>
-            <w:r>
-              <w:rPr>
-                <w:rFonts w:ascii="Times New Roman" w:cs="Times New Roman" w:eastAsia="Times New Roman" w:hAnsi="Times New Roman"/>
-                <w:i w:val="1"/>
-                <w:iCs w:val="1"/>
-                <w:color w:val="7F7F7F"/>
+                <w:sz w:val="22"/>
+                <w:szCs w:val="22"/>
+              </w:rPr>
+            </w:pPr>
+            <w:r>
+              <w:rPr>
+                <w:rFonts w:ascii="Times New Roman" w:cs="Times New Roman" w:eastAsia="Times New Roman" w:hAnsi="Times New Roman"/>
                 <w:sz w:val="22"/>
                 <w:szCs w:val="22"/>
               </w:rPr>
@@ -1609,19 +1737,13 @@
               <w:jc w:val="left"/>
               <w:rPr>
                 <w:rFonts w:ascii="Times New Roman" w:cs="Times New Roman" w:eastAsia="Times New Roman" w:hAnsi="Times New Roman"/>
-                <w:i w:val="1"/>
-                <w:iCs w:val="1"/>
-                <w:color w:val="7F7F7F"/>
-                <w:sz w:val="22"/>
-                <w:szCs w:val="22"/>
-              </w:rPr>
-            </w:pPr>
-            <w:r>
-              <w:rPr>
-                <w:rFonts w:ascii="Times New Roman" w:cs="Times New Roman" w:eastAsia="Times New Roman" w:hAnsi="Times New Roman"/>
-                <w:i w:val="1"/>
-                <w:iCs w:val="1"/>
-                <w:color w:val="7F7F7F"/>
+                <w:sz w:val="22"/>
+                <w:szCs w:val="22"/>
+              </w:rPr>
+            </w:pPr>
+            <w:r>
+              <w:rPr>
+                <w:rFonts w:ascii="Times New Roman" w:cs="Times New Roman" w:eastAsia="Times New Roman" w:hAnsi="Times New Roman"/>
                 <w:sz w:val="22"/>
                 <w:szCs w:val="22"/>
               </w:rPr>
@@ -1644,19 +1766,13 @@
               <w:jc w:val="left"/>
               <w:rPr>
                 <w:rFonts w:ascii="Times New Roman" w:cs="Times New Roman" w:eastAsia="Times New Roman" w:hAnsi="Times New Roman"/>
-                <w:i w:val="1"/>
-                <w:iCs w:val="1"/>
-                <w:color w:val="7F7F7F"/>
-                <w:sz w:val="22"/>
-                <w:szCs w:val="22"/>
-              </w:rPr>
-            </w:pPr>
-            <w:r>
-              <w:rPr>
-                <w:rFonts w:ascii="Times New Roman" w:cs="Times New Roman" w:eastAsia="Times New Roman" w:hAnsi="Times New Roman"/>
-                <w:i w:val="1"/>
-                <w:iCs w:val="1"/>
-                <w:color w:val="7F7F7F"/>
+                <w:sz w:val="22"/>
+                <w:szCs w:val="22"/>
+              </w:rPr>
+            </w:pPr>
+            <w:r>
+              <w:rPr>
+                <w:rFonts w:ascii="Times New Roman" w:cs="Times New Roman" w:eastAsia="Times New Roman" w:hAnsi="Times New Roman"/>
                 <w:sz w:val="22"/>
                 <w:szCs w:val="22"/>
               </w:rPr>
@@ -1674,23 +1790,17 @@
               <w:jc w:val="left"/>
               <w:rPr>
                 <w:rFonts w:ascii="Times New Roman" w:cs="Times New Roman" w:eastAsia="Times New Roman" w:hAnsi="Times New Roman"/>
-                <w:i w:val="1"/>
-                <w:iCs w:val="1"/>
-                <w:color w:val="7F7F7F"/>
-                <w:sz w:val="22"/>
-                <w:szCs w:val="22"/>
-              </w:rPr>
-            </w:pPr>
-            <w:r>
-              <w:rPr>
-                <w:rFonts w:ascii="Times New Roman" w:cs="Times New Roman" w:eastAsia="Times New Roman" w:hAnsi="Times New Roman"/>
-                <w:i w:val="1"/>
-                <w:iCs w:val="1"/>
-                <w:color w:val="7F7F7F"/>
-                <w:sz w:val="22"/>
-                <w:szCs w:val="22"/>
-              </w:rPr>
-              <w:t xml:space="preserve">Business Rule – quy tắc nghiệp vụ</w:t>
+                <w:sz w:val="22"/>
+                <w:szCs w:val="22"/>
+              </w:rPr>
+            </w:pPr>
+            <w:r>
+              <w:rPr>
+                <w:rFonts w:ascii="Times New Roman" w:cs="Times New Roman" w:eastAsia="Times New Roman" w:hAnsi="Times New Roman"/>
+                <w:sz w:val="22"/>
+                <w:szCs w:val="22"/>
+              </w:rPr>
+              <w:t xml:space="preserve">Business Rule – quy tắc nghiệp vụ, đánh số BR-&lt;mảng&gt;&lt;số&gt; (mục 1.2)</w:t>
             </w:r>
           </w:p>
         </w:tc>
@@ -1719,7 +1829,7 @@
                 <w:sz w:val="22"/>
                 <w:szCs w:val="22"/>
               </w:rPr>
-              <w:t xml:space="preserve">ICD-10</w:t>
+              <w:t xml:space="preserve">MT</w:t>
             </w:r>
           </w:p>
         </w:tc>
@@ -1737,6 +1847,14 @@
                 <w:szCs w:val="22"/>
               </w:rPr>
             </w:pPr>
+            <w:r>
+              <w:rPr>
+                <w:rFonts w:ascii="Times New Roman" w:cs="Times New Roman" w:eastAsia="Times New Roman" w:hAnsi="Times New Roman"/>
+                <w:sz w:val="22"/>
+                <w:szCs w:val="22"/>
+              </w:rPr>
+              <w:t xml:space="preserve">Mục tiêu hệ thống (mục 1.1)</w:t>
+            </w:r>
           </w:p>
         </w:tc>
       </w:tr>
@@ -1764,7 +1882,7 @@
                 <w:sz w:val="22"/>
                 <w:szCs w:val="22"/>
               </w:rPr>
-              <w:t xml:space="preserve">EER</w:t>
+              <w:t xml:space="preserve">ICD-10</w:t>
             </w:r>
           </w:p>
         </w:tc>
@@ -1782,6 +1900,14 @@
                 <w:szCs w:val="22"/>
               </w:rPr>
             </w:pPr>
+            <w:r>
+              <w:rPr>
+                <w:rFonts w:ascii="Times New Roman" w:cs="Times New Roman" w:eastAsia="Times New Roman" w:hAnsi="Times New Roman"/>
+                <w:sz w:val="22"/>
+                <w:szCs w:val="22"/>
+              </w:rPr>
+              <w:t xml:space="preserve">Bảng phân loại quốc tế bệnh tật lần thứ 10 của WHO, dùng để mã hóa chẩn đoán</w:t>
+            </w:r>
           </w:p>
         </w:tc>
       </w:tr>
@@ -1809,6 +1935,59 @@
                 <w:sz w:val="22"/>
                 <w:szCs w:val="22"/>
               </w:rPr>
+              <w:t xml:space="preserve">EER</w:t>
+            </w:r>
+          </w:p>
+        </w:tc>
+        <w:tc>
+          <w:tcPr>
+            <w:tcW w:w="6592" w:type="dxa"/>
+          </w:tcPr>
+          <w:p>
+            <w:pPr>
+              <w:spacing w:before="20" w:after="20"/>
+              <w:jc w:val="left"/>
+              <w:rPr>
+                <w:rFonts w:ascii="Times New Roman" w:cs="Times New Roman" w:eastAsia="Times New Roman" w:hAnsi="Times New Roman"/>
+                <w:sz w:val="22"/>
+                <w:szCs w:val="22"/>
+              </w:rPr>
+            </w:pPr>
+            <w:r>
+              <w:rPr>
+                <w:rFonts w:ascii="Times New Roman" w:cs="Times New Roman" w:eastAsia="Times New Roman" w:hAnsi="Times New Roman"/>
+                <w:sz w:val="22"/>
+                <w:szCs w:val="22"/>
+              </w:rPr>
+              <w:t xml:space="preserve">Enhanced Entity-Relationship – mô hình thực thể liên kết mở rộng, có phân lớp và tổng quát hóa</w:t>
+            </w:r>
+          </w:p>
+        </w:tc>
+      </w:tr>
+      <w:tr>
+        <w:trPr>
+          <w:cantSplit/>
+        </w:trPr>
+        <w:tc>
+          <w:tcPr>
+            <w:tcW w:w="2198" w:type="dxa"/>
+          </w:tcPr>
+          <w:p>
+            <w:pPr>
+              <w:spacing w:before="20" w:after="20"/>
+              <w:jc w:val="left"/>
+              <w:rPr>
+                <w:rFonts w:ascii="Times New Roman" w:cs="Times New Roman" w:eastAsia="Times New Roman" w:hAnsi="Times New Roman"/>
+                <w:sz w:val="22"/>
+                <w:szCs w:val="22"/>
+              </w:rPr>
+            </w:pPr>
+            <w:r>
+              <w:rPr>
+                <w:rFonts w:ascii="Times New Roman" w:cs="Times New Roman" w:eastAsia="Times New Roman" w:hAnsi="Times New Roman"/>
+                <w:sz w:val="22"/>
+                <w:szCs w:val="22"/>
+              </w:rPr>
               <w:t xml:space="preserve">RBAC</w:t>
             </w:r>
           </w:p>
@@ -1827,6 +2006,120 @@
                 <w:szCs w:val="22"/>
               </w:rPr>
             </w:pPr>
+            <w:r>
+              <w:rPr>
+                <w:rFonts w:ascii="Times New Roman" w:cs="Times New Roman" w:eastAsia="Times New Roman" w:hAnsi="Times New Roman"/>
+                <w:sz w:val="22"/>
+                <w:szCs w:val="22"/>
+              </w:rPr>
+              <w:t xml:space="preserve">Role-Based Access Control – phân quyền truy cập theo vai trò</w:t>
+            </w:r>
+          </w:p>
+        </w:tc>
+      </w:tr>
+      <w:tr>
+        <w:trPr>
+          <w:cantSplit/>
+        </w:trPr>
+        <w:tc>
+          <w:tcPr>
+            <w:tcW w:w="2198" w:type="dxa"/>
+          </w:tcPr>
+          <w:p>
+            <w:pPr>
+              <w:spacing w:before="20" w:after="20"/>
+              <w:jc w:val="left"/>
+              <w:rPr>
+                <w:rFonts w:ascii="Times New Roman" w:cs="Times New Roman" w:eastAsia="Times New Roman" w:hAnsi="Times New Roman"/>
+                <w:sz w:val="22"/>
+                <w:szCs w:val="22"/>
+              </w:rPr>
+            </w:pPr>
+            <w:r>
+              <w:rPr>
+                <w:rFonts w:ascii="Times New Roman" w:cs="Times New Roman" w:eastAsia="Times New Roman" w:hAnsi="Times New Roman"/>
+                <w:sz w:val="22"/>
+                <w:szCs w:val="22"/>
+              </w:rPr>
+              <w:t xml:space="preserve">Tư vấn từ xa</w:t>
+            </w:r>
+          </w:p>
+        </w:tc>
+        <w:tc>
+          <w:tcPr>
+            <w:tcW w:w="6592" w:type="dxa"/>
+          </w:tcPr>
+          <w:p>
+            <w:pPr>
+              <w:spacing w:before="20" w:after="20"/>
+              <w:jc w:val="left"/>
+              <w:rPr>
+                <w:rFonts w:ascii="Times New Roman" w:cs="Times New Roman" w:eastAsia="Times New Roman" w:hAnsi="Times New Roman"/>
+                <w:sz w:val="22"/>
+                <w:szCs w:val="22"/>
+              </w:rPr>
+            </w:pPr>
+            <w:r>
+              <w:rPr>
+                <w:rFonts w:ascii="Times New Roman" w:cs="Times New Roman" w:eastAsia="Times New Roman" w:hAnsi="Times New Roman"/>
+                <w:sz w:val="22"/>
+                <w:szCs w:val="22"/>
+              </w:rPr>
+              <w:t xml:space="preserve">Khám, tư vấn qua video giữa bác sĩ và bệnh nhân; hệ thống chỉ lưu thông tin phiên</w:t>
+            </w:r>
+          </w:p>
+        </w:tc>
+      </w:tr>
+      <w:tr>
+        <w:trPr>
+          <w:cantSplit/>
+        </w:trPr>
+        <w:tc>
+          <w:tcPr>
+            <w:tcW w:w="2198" w:type="dxa"/>
+          </w:tcPr>
+          <w:p>
+            <w:pPr>
+              <w:spacing w:before="20" w:after="20"/>
+              <w:jc w:val="left"/>
+              <w:rPr>
+                <w:rFonts w:ascii="Times New Roman" w:cs="Times New Roman" w:eastAsia="Times New Roman" w:hAnsi="Times New Roman"/>
+                <w:sz w:val="22"/>
+                <w:szCs w:val="22"/>
+              </w:rPr>
+            </w:pPr>
+            <w:r>
+              <w:rPr>
+                <w:rFonts w:ascii="Times New Roman" w:cs="Times New Roman" w:eastAsia="Times New Roman" w:hAnsi="Times New Roman"/>
+                <w:sz w:val="22"/>
+                <w:szCs w:val="22"/>
+              </w:rPr>
+              <w:t xml:space="preserve">Giấy chuyển chuyên khoa</w:t>
+            </w:r>
+          </w:p>
+        </w:tc>
+        <w:tc>
+          <w:tcPr>
+            <w:tcW w:w="6592" w:type="dxa"/>
+          </w:tcPr>
+          <w:p>
+            <w:pPr>
+              <w:spacing w:before="20" w:after="20"/>
+              <w:jc w:val="left"/>
+              <w:rPr>
+                <w:rFonts w:ascii="Times New Roman" w:cs="Times New Roman" w:eastAsia="Times New Roman" w:hAnsi="Times New Roman"/>
+                <w:sz w:val="22"/>
+                <w:szCs w:val="22"/>
+              </w:rPr>
+            </w:pPr>
+            <w:r>
+              <w:rPr>
+                <w:rFonts w:ascii="Times New Roman" w:cs="Times New Roman" w:eastAsia="Times New Roman" w:hAnsi="Times New Roman"/>
+                <w:sz w:val="22"/>
+                <w:szCs w:val="22"/>
+              </w:rPr>
+              <w:t xml:space="preserve">Giấy do BS ĐK lập để bệnh nhân khám BS CK lần đầu trong phòng khám; không phải giấy chuyển tuyến BHYT</w:t>
+            </w:r>
           </w:p>
         </w:tc>
       </w:tr>
@@ -1879,7 +2172,7 @@
     </w:p>
     <w:p>
       <w:pPr>
-        <w:ind w:left="567" w:firstLine="0"/>
+        <w:ind w:left="284" w:firstLine="0"/>
         <w:jc w:val="both"/>
         <w:rPr>
           <w:rFonts w:ascii="Times New Roman" w:cs="Times New Roman" w:eastAsia="Times New Roman" w:hAnsi="Times New Roman"/>
@@ -1888,40 +2181,8 @@
       <w:r>
         <w:rPr>
           <w:rFonts w:ascii="Times New Roman" w:cs="Times New Roman" w:eastAsia="Times New Roman" w:hAnsi="Times New Roman"/>
-          <w:b w:val="1"/>
-          <w:bCs w:val="1"/>
-          <w:i w:val="1"/>
-          <w:iCs w:val="1"/>
-          <w:color w:val="7F7F7F"/>
-        </w:rPr>
-        <w:t xml:space="preserve">Phụ trách: </w:t>
-      </w:r>
-      <w:r>
-        <w:rPr>
-          <w:rFonts w:ascii="Times New Roman" w:cs="Times New Roman" w:eastAsia="Times New Roman" w:hAnsi="Times New Roman"/>
-          <w:i w:val="1"/>
-          <w:iCs w:val="1"/>
-          <w:color w:val="7F7F7F"/>
-        </w:rPr>
-        <w:t xml:space="preserve">Lê Ngọc Khôi – nộp ở v1, tuần 2.</w:t>
-      </w:r>
-    </w:p>
-    <w:p>
-      <w:pPr>
-        <w:ind w:left="567" w:firstLine="0"/>
-        <w:jc w:val="both"/>
-        <w:rPr>
-          <w:rFonts w:ascii="Times New Roman" w:cs="Times New Roman" w:eastAsia="Times New Roman" w:hAnsi="Times New Roman"/>
-        </w:rPr>
-      </w:pPr>
-      <w:r>
-        <w:rPr>
-          <w:rFonts w:ascii="Times New Roman" w:cs="Times New Roman" w:eastAsia="Times New Roman" w:hAnsi="Times New Roman"/>
-          <w:i w:val="1"/>
-          <w:iCs w:val="1"/>
-          <w:color w:val="7F7F7F"/>
-        </w:rPr>
-        <w:t xml:space="preserve">Mỗi mục tiêu phải đo/kiểm chứng được và liên kết tới quy tắc nghiệp vụ (1.2) hoặc phần cài đặt (4, 5).</w:t>
+        </w:rPr>
+        <w:t xml:space="preserve">Mỗi mục tiêu dưới đây có tiêu chí kiểm chứng cụ thể và liên kết tới quy tắc nghiệp vụ (mục 1.2), truy vấn (mục 4.2) hoặc bài kiểm tra (mục 5).</w:t>
       </w:r>
     </w:p>
     <w:tbl>
@@ -2084,19 +2345,13 @@
               <w:jc w:val="left"/>
               <w:rPr>
                 <w:rFonts w:ascii="Times New Roman" w:cs="Times New Roman" w:eastAsia="Times New Roman" w:hAnsi="Times New Roman"/>
-                <w:i w:val="1"/>
-                <w:iCs w:val="1"/>
-                <w:color w:val="7F7F7F"/>
-                <w:sz w:val="22"/>
-                <w:szCs w:val="22"/>
-              </w:rPr>
-            </w:pPr>
-            <w:r>
-              <w:rPr>
-                <w:rFonts w:ascii="Times New Roman" w:cs="Times New Roman" w:eastAsia="Times New Roman" w:hAnsi="Times New Roman"/>
-                <w:i w:val="1"/>
-                <w:iCs w:val="1"/>
-                <w:color w:val="7F7F7F"/>
+                <w:sz w:val="22"/>
+                <w:szCs w:val="22"/>
+              </w:rPr>
+            </w:pPr>
+            <w:r>
+              <w:rPr>
+                <w:rFonts w:ascii="Times New Roman" w:cs="Times New Roman" w:eastAsia="Times New Roman" w:hAnsi="Times New Roman"/>
                 <w:sz w:val="22"/>
                 <w:szCs w:val="22"/>
               </w:rPr>
@@ -2114,19 +2369,13 @@
               <w:jc w:val="left"/>
               <w:rPr>
                 <w:rFonts w:ascii="Times New Roman" w:cs="Times New Roman" w:eastAsia="Times New Roman" w:hAnsi="Times New Roman"/>
-                <w:i w:val="1"/>
-                <w:iCs w:val="1"/>
-                <w:color w:val="7F7F7F"/>
-                <w:sz w:val="22"/>
-                <w:szCs w:val="22"/>
-              </w:rPr>
-            </w:pPr>
-            <w:r>
-              <w:rPr>
-                <w:rFonts w:ascii="Times New Roman" w:cs="Times New Roman" w:eastAsia="Times New Roman" w:hAnsi="Times New Roman"/>
-                <w:i w:val="1"/>
-                <w:iCs w:val="1"/>
-                <w:color w:val="7F7F7F"/>
+                <w:sz w:val="22"/>
+                <w:szCs w:val="22"/>
+              </w:rPr>
+            </w:pPr>
+            <w:r>
+              <w:rPr>
+                <w:rFonts w:ascii="Times New Roman" w:cs="Times New Roman" w:eastAsia="Times New Roman" w:hAnsi="Times New Roman"/>
                 <w:sz w:val="22"/>
                 <w:szCs w:val="22"/>
               </w:rPr>
@@ -2144,23 +2393,17 @@
               <w:jc w:val="left"/>
               <w:rPr>
                 <w:rFonts w:ascii="Times New Roman" w:cs="Times New Roman" w:eastAsia="Times New Roman" w:hAnsi="Times New Roman"/>
-                <w:i w:val="1"/>
-                <w:iCs w:val="1"/>
-                <w:color w:val="7F7F7F"/>
-                <w:sz w:val="22"/>
-                <w:szCs w:val="22"/>
-              </w:rPr>
-            </w:pPr>
-            <w:r>
-              <w:rPr>
-                <w:rFonts w:ascii="Times New Roman" w:cs="Times New Roman" w:eastAsia="Times New Roman" w:hAnsi="Times New Roman"/>
-                <w:i w:val="1"/>
-                <w:iCs w:val="1"/>
-                <w:color w:val="7F7F7F"/>
-                <w:sz w:val="22"/>
-                <w:szCs w:val="22"/>
-              </w:rPr>
-              <w:t xml:space="preserve">Mỗi bác sĩ thuộc đúng một loại; truy vấn được theo chuyên khoa</w:t>
+                <w:sz w:val="22"/>
+                <w:szCs w:val="22"/>
+              </w:rPr>
+            </w:pPr>
+            <w:r>
+              <w:rPr>
+                <w:rFonts w:ascii="Times New Roman" w:cs="Times New Roman" w:eastAsia="Times New Roman" w:hAnsi="Times New Roman"/>
+                <w:sz w:val="22"/>
+                <w:szCs w:val="22"/>
+              </w:rPr>
+              <w:t xml:space="preserve">Mỗi bác sĩ thuộc đúng một loại (TC-03); truy vấn được bác sĩ theo chuyên khoa (Q01)</w:t>
             </w:r>
           </w:p>
         </w:tc>
@@ -2174,19 +2417,13 @@
               <w:jc w:val="left"/>
               <w:rPr>
                 <w:rFonts w:ascii="Times New Roman" w:cs="Times New Roman" w:eastAsia="Times New Roman" w:hAnsi="Times New Roman"/>
-                <w:i w:val="1"/>
-                <w:iCs w:val="1"/>
-                <w:color w:val="7F7F7F"/>
-                <w:sz w:val="22"/>
-                <w:szCs w:val="22"/>
-              </w:rPr>
-            </w:pPr>
-            <w:r>
-              <w:rPr>
-                <w:rFonts w:ascii="Times New Roman" w:cs="Times New Roman" w:eastAsia="Times New Roman" w:hAnsi="Times New Roman"/>
-                <w:i w:val="1"/>
-                <w:iCs w:val="1"/>
-                <w:color w:val="7F7F7F"/>
+                <w:sz w:val="22"/>
+                <w:szCs w:val="22"/>
+              </w:rPr>
+            </w:pPr>
+            <w:r>
+              <w:rPr>
+                <w:rFonts w:ascii="Times New Roman" w:cs="Times New Roman" w:eastAsia="Times New Roman" w:hAnsi="Times New Roman"/>
                 <w:sz w:val="22"/>
                 <w:szCs w:val="22"/>
               </w:rPr>
@@ -2209,19 +2446,13 @@
               <w:jc w:val="left"/>
               <w:rPr>
                 <w:rFonts w:ascii="Times New Roman" w:cs="Times New Roman" w:eastAsia="Times New Roman" w:hAnsi="Times New Roman"/>
-                <w:i w:val="1"/>
-                <w:iCs w:val="1"/>
-                <w:color w:val="7F7F7F"/>
-                <w:sz w:val="22"/>
-                <w:szCs w:val="22"/>
-              </w:rPr>
-            </w:pPr>
-            <w:r>
-              <w:rPr>
-                <w:rFonts w:ascii="Times New Roman" w:cs="Times New Roman" w:eastAsia="Times New Roman" w:hAnsi="Times New Roman"/>
-                <w:i w:val="1"/>
-                <w:iCs w:val="1"/>
-                <w:color w:val="7F7F7F"/>
+                <w:sz w:val="22"/>
+                <w:szCs w:val="22"/>
+              </w:rPr>
+            </w:pPr>
+            <w:r>
+              <w:rPr>
+                <w:rFonts w:ascii="Times New Roman" w:cs="Times New Roman" w:eastAsia="Times New Roman" w:hAnsi="Times New Roman"/>
                 <w:sz w:val="22"/>
                 <w:szCs w:val="22"/>
               </w:rPr>
@@ -2239,19 +2470,13 @@
               <w:jc w:val="left"/>
               <w:rPr>
                 <w:rFonts w:ascii="Times New Roman" w:cs="Times New Roman" w:eastAsia="Times New Roman" w:hAnsi="Times New Roman"/>
-                <w:i w:val="1"/>
-                <w:iCs w:val="1"/>
-                <w:color w:val="7F7F7F"/>
-                <w:sz w:val="22"/>
-                <w:szCs w:val="22"/>
-              </w:rPr>
-            </w:pPr>
-            <w:r>
-              <w:rPr>
-                <w:rFonts w:ascii="Times New Roman" w:cs="Times New Roman" w:eastAsia="Times New Roman" w:hAnsi="Times New Roman"/>
-                <w:i w:val="1"/>
-                <w:iCs w:val="1"/>
-                <w:color w:val="7F7F7F"/>
+                <w:sz w:val="22"/>
+                <w:szCs w:val="22"/>
+              </w:rPr>
+            </w:pPr>
+            <w:r>
+              <w:rPr>
+                <w:rFonts w:ascii="Times New Roman" w:cs="Times New Roman" w:eastAsia="Times New Roman" w:hAnsi="Times New Roman"/>
                 <w:sz w:val="22"/>
                 <w:szCs w:val="22"/>
               </w:rPr>
@@ -2269,23 +2494,17 @@
               <w:jc w:val="left"/>
               <w:rPr>
                 <w:rFonts w:ascii="Times New Roman" w:cs="Times New Roman" w:eastAsia="Times New Roman" w:hAnsi="Times New Roman"/>
-                <w:i w:val="1"/>
-                <w:iCs w:val="1"/>
-                <w:color w:val="7F7F7F"/>
-                <w:sz w:val="22"/>
-                <w:szCs w:val="22"/>
-              </w:rPr>
-            </w:pPr>
-            <w:r>
-              <w:rPr>
-                <w:rFonts w:ascii="Times New Roman" w:cs="Times New Roman" w:eastAsia="Times New Roman" w:hAnsi="Times New Roman"/>
-                <w:i w:val="1"/>
-                <w:iCs w:val="1"/>
-                <w:color w:val="7F7F7F"/>
-                <w:sz w:val="22"/>
-                <w:szCs w:val="22"/>
-              </w:rPr>
-              <w:t xml:space="preserve">Trigger chặn 100% lịch trùng giờ (test 5.1)</w:t>
+                <w:sz w:val="22"/>
+                <w:szCs w:val="22"/>
+              </w:rPr>
+            </w:pPr>
+            <w:r>
+              <w:rPr>
+                <w:rFonts w:ascii="Times New Roman" w:cs="Times New Roman" w:eastAsia="Times New Roman" w:hAnsi="Times New Roman"/>
+                <w:sz w:val="22"/>
+                <w:szCs w:val="22"/>
+              </w:rPr>
+              <w:t xml:space="preserve">Lịch hẹn trùng giờ hoặc ngoài ca đều bị CSDL từ chối (TC-01, TC-02)</w:t>
             </w:r>
           </w:p>
         </w:tc>
@@ -2299,23 +2518,17 @@
               <w:jc w:val="left"/>
               <w:rPr>
                 <w:rFonts w:ascii="Times New Roman" w:cs="Times New Roman" w:eastAsia="Times New Roman" w:hAnsi="Times New Roman"/>
-                <w:i w:val="1"/>
-                <w:iCs w:val="1"/>
-                <w:color w:val="7F7F7F"/>
-                <w:sz w:val="22"/>
-                <w:szCs w:val="22"/>
-              </w:rPr>
-            </w:pPr>
-            <w:r>
-              <w:rPr>
-                <w:rFonts w:ascii="Times New Roman" w:cs="Times New Roman" w:eastAsia="Times New Roman" w:hAnsi="Times New Roman"/>
-                <w:i w:val="1"/>
-                <w:iCs w:val="1"/>
-                <w:color w:val="7F7F7F"/>
-                <w:sz w:val="22"/>
-                <w:szCs w:val="22"/>
-              </w:rPr>
-              <w:t xml:space="preserve">BR-B01, BR-B02</w:t>
+                <w:sz w:val="22"/>
+                <w:szCs w:val="22"/>
+              </w:rPr>
+            </w:pPr>
+            <w:r>
+              <w:rPr>
+                <w:rFonts w:ascii="Times New Roman" w:cs="Times New Roman" w:eastAsia="Times New Roman" w:hAnsi="Times New Roman"/>
+                <w:sz w:val="22"/>
+                <w:szCs w:val="22"/>
+              </w:rPr>
+              <w:t xml:space="preserve">BR-B01, BR-B02, BR-B07</w:t>
             </w:r>
           </w:p>
         </w:tc>
@@ -2386,6 +2599,14 @@
                 <w:szCs w:val="22"/>
               </w:rPr>
             </w:pPr>
+            <w:r>
+              <w:rPr>
+                <w:rFonts w:ascii="Times New Roman" w:cs="Times New Roman" w:eastAsia="Times New Roman" w:hAnsi="Times New Roman"/>
+                <w:sz w:val="22"/>
+                <w:szCs w:val="22"/>
+              </w:rPr>
+              <w:t xml:space="preserve">Mỗi lịch hẹn thuộc đúng một hình thức; tư vấn từ xa thiếu đường dẫn phiên bị từ chối; thống kê được tỉ lệ từ xa / trực tiếp (Q08)</w:t>
+            </w:r>
           </w:p>
         </w:tc>
         <w:tc>
@@ -2402,6 +2623,14 @@
                 <w:szCs w:val="22"/>
               </w:rPr>
             </w:pPr>
+            <w:r>
+              <w:rPr>
+                <w:rFonts w:ascii="Times New Roman" w:cs="Times New Roman" w:eastAsia="Times New Roman" w:hAnsi="Times New Roman"/>
+                <w:sz w:val="22"/>
+                <w:szCs w:val="22"/>
+              </w:rPr>
+              <w:t xml:space="preserve">BR-B04, BR-B06</w:t>
+            </w:r>
           </w:p>
         </w:tc>
       </w:tr>
@@ -2471,6 +2700,14 @@
                 <w:szCs w:val="22"/>
               </w:rPr>
             </w:pPr>
+            <w:r>
+              <w:rPr>
+                <w:rFonts w:ascii="Times New Roman" w:cs="Times New Roman" w:eastAsia="Times New Roman" w:hAnsi="Times New Roman"/>
+                <w:sz w:val="22"/>
+                <w:szCs w:val="22"/>
+              </w:rPr>
+              <w:t xml:space="preserve">Lệnh DELETE hồ sơ bệnh án bị chặn (TC-05); truy xuất được toàn bộ lịch sử khám của một bệnh nhân (Q11)</w:t>
+            </w:r>
           </w:p>
         </w:tc>
         <w:tc>
@@ -2487,6 +2724,14 @@
                 <w:szCs w:val="22"/>
               </w:rPr>
             </w:pPr>
+            <w:r>
+              <w:rPr>
+                <w:rFonts w:ascii="Times New Roman" w:cs="Times New Roman" w:eastAsia="Times New Roman" w:hAnsi="Times New Roman"/>
+                <w:sz w:val="22"/>
+                <w:szCs w:val="22"/>
+              </w:rPr>
+              <w:t xml:space="preserve">BR-C03, BR-C05</w:t>
+            </w:r>
           </w:p>
         </w:tc>
       </w:tr>
@@ -2556,6 +2801,14 @@
                 <w:szCs w:val="22"/>
               </w:rPr>
             </w:pPr>
+            <w:r>
+              <w:rPr>
+                <w:rFonts w:ascii="Times New Roman" w:cs="Times New Roman" w:eastAsia="Times New Roman" w:hAnsi="Times New Roman"/>
+                <w:sz w:val="22"/>
+                <w:szCs w:val="22"/>
+              </w:rPr>
+              <w:t xml:space="preserve">Kê thuốc chứa hoạt chất bệnh nhân dị ứng bị từ chối (TC-04); số lượng không dương bị từ chối (TC-07)</w:t>
+            </w:r>
           </w:p>
         </w:tc>
         <w:tc>
@@ -2572,6 +2825,14 @@
                 <w:szCs w:val="22"/>
               </w:rPr>
             </w:pPr>
+            <w:r>
+              <w:rPr>
+                <w:rFonts w:ascii="Times New Roman" w:cs="Times New Roman" w:eastAsia="Times New Roman" w:hAnsi="Times New Roman"/>
+                <w:sz w:val="22"/>
+                <w:szCs w:val="22"/>
+              </w:rPr>
+              <w:t xml:space="preserve">BR-C01, BR-C02, BR-C04</w:t>
+            </w:r>
           </w:p>
         </w:tc>
       </w:tr>
@@ -2641,6 +2902,14 @@
                 <w:szCs w:val="22"/>
               </w:rPr>
             </w:pPr>
+            <w:r>
+              <w:rPr>
+                <w:rFonts w:ascii="Times New Roman" w:cs="Times New Roman" w:eastAsia="Times New Roman" w:hAnsi="Times New Roman"/>
+                <w:sz w:val="22"/>
+                <w:szCs w:val="22"/>
+              </w:rPr>
+              <w:t xml:space="preserve">Có 4 role (quản trị, bác sĩ, lễ tân, bệnh nhân); thao tác ngoài quyền báo permission denied</w:t>
+            </w:r>
           </w:p>
         </w:tc>
         <w:tc>
@@ -2657,6 +2926,14 @@
                 <w:szCs w:val="22"/>
               </w:rPr>
             </w:pPr>
+            <w:r>
+              <w:rPr>
+                <w:rFonts w:ascii="Times New Roman" w:cs="Times New Roman" w:eastAsia="Times New Roman" w:hAnsi="Times New Roman"/>
+                <w:sz w:val="22"/>
+                <w:szCs w:val="22"/>
+              </w:rPr>
+              <w:t xml:space="preserve">Mục 5.2</w:t>
+            </w:r>
           </w:p>
         </w:tc>
       </w:tr>
@@ -2726,6 +3003,14 @@
                 <w:szCs w:val="22"/>
               </w:rPr>
             </w:pPr>
+            <w:r>
+              <w:rPr>
+                <w:rFonts w:ascii="Times New Roman" w:cs="Times New Roman" w:eastAsia="Times New Roman" w:hAnsi="Times New Roman"/>
+                <w:sz w:val="22"/>
+                <w:szCs w:val="22"/>
+              </w:rPr>
+              <w:t xml:space="preserve">Ít nhất 10 truy vấn thống kê chạy có kết quả trên dữ liệu mẫu (Q01–Q12)</w:t>
+            </w:r>
           </w:p>
         </w:tc>
         <w:tc>
@@ -2742,6 +3027,14 @@
                 <w:szCs w:val="22"/>
               </w:rPr>
             </w:pPr>
+            <w:r>
+              <w:rPr>
+                <w:rFonts w:ascii="Times New Roman" w:cs="Times New Roman" w:eastAsia="Times New Roman" w:hAnsi="Times New Roman"/>
+                <w:sz w:val="22"/>
+                <w:szCs w:val="22"/>
+              </w:rPr>
+              <w:t xml:space="preserve">Mục 4.2</w:t>
+            </w:r>
           </w:p>
         </w:tc>
       </w:tr>

</xml_diff>